<commit_message>
Verify Oct 2 figures and distill the views that survive
Recompute multiples, the price path, dilution, and the ADR conversion. Keep sentences whose arithmetic holds, and state the ADR 10x ratio and the Sungho share-count fork as conditions instead of point targets.

Co-authored-by: choijunh-cloud <choijunh-cloud@users.noreply.github.com>
</commit_message>
<xml_diff>
--- a/lectures/10월 2일 (메모리, 광통신, 매크로).docx
+++ b/lectures/10월 2일 (메모리, 광통신, 매크로).docx
@@ -485,7 +485,7 @@
                 <w:color w:val="1A1A1A"/>
                 <w:sz w:val="19"/>
               </w:rPr>
-              <w:t>10/2 종가. 본주 PER 4배대, ADR 프리미엄 44%</w:t>
+              <w:t>본주 27년 4.1배, 마이크론 대비 약 31% 할인. ADR 44%는 배율 10일 때</w:t>
             </w:r>
           </w:p>
         </w:tc>
@@ -853,7 +853,7 @@
                 <w:color w:val="1A1A1A"/>
                 <w:sz w:val="19"/>
               </w:rPr>
-              <w:t>정렬 장비. 희석 후 111백만주, 자리는 5~6만 중반</w:t>
+              <w:t>정렬 장비. 111백만주 확인 전 단일 목표가 금지</w:t>
             </w:r>
           </w:p>
         </w:tc>
@@ -1037,7 +1037,7 @@
                 <w:color w:val="1A1A1A"/>
                 <w:sz w:val="19"/>
               </w:rPr>
-              <w:t>규제 간극, IPO 2조 달러는 Bull</w:t>
+              <w:t>2조는 플랫폼 배수. 마진 25%만으로는 약 1.1조</w:t>
             </w:r>
           </w:p>
         </w:tc>
@@ -1725,7 +1725,7 @@
                 <w:color w:val="1A1A1A"/>
                 <w:sz w:val="19"/>
               </w:rPr>
-              <w:t>ADR 263만원, 프리미엄 44%</w:t>
+              <w:t>28만원 EPS면 이미 6.6배</w:t>
             </w:r>
           </w:p>
         </w:tc>
@@ -1754,7 +1754,7 @@
                 <w:color w:val="1A1A1A"/>
                 <w:sz w:val="19"/>
               </w:rPr>
-              <w:t>싸 보이는 4배는 피크 이익 착시를 경계</w:t>
+              <w:t>220~250만은 8~9배. ADR 263만은 배율 10</w:t>
             </w:r>
           </w:p>
         </w:tc>
@@ -1862,7 +1862,7 @@
                 <w:color w:val="1A1A1A"/>
                 <w:sz w:val="19"/>
               </w:rPr>
-              <w:t>환율 1480→1370이면 컨센 약 10% 여지</w:t>
+              <w:t>환율 1480→1370의 1차 효과는 −7.4%</w:t>
             </w:r>
           </w:p>
         </w:tc>
@@ -1970,7 +1970,7 @@
                 <w:color w:val="1A1A1A"/>
                 <w:sz w:val="19"/>
               </w:rPr>
-              <w:t>피크 대비 가격 -26%. 이익은 그보다 덜 하락</w:t>
+              <w:t>가격 −26%. Base 이익 한복판은 약 −36%</w:t>
             </w:r>
           </w:p>
         </w:tc>
@@ -2402,7 +2402,7 @@
                 <w:color w:val="1A1A1A"/>
                 <w:sz w:val="19"/>
               </w:rPr>
-              <w:t>28년 PER 30~40배 하단, 5~6만원 중반</w:t>
+              <w:t>30배 하단은 4.2만 또는 2.9만</w:t>
             </w:r>
           </w:p>
         </w:tc>
@@ -2465,7 +2465,7 @@
                 <w:color w:val="1A1A1A"/>
                 <w:sz w:val="19"/>
               </w:rPr>
-              <w:t>2028년 매출 1,950억 달러 전제</w:t>
+              <w:t>사모 9,650억은 CAGR 21.4%로 설명</w:t>
             </w:r>
           </w:p>
           <w:p>
@@ -2481,7 +2481,7 @@
                 <w:color w:val="1A1A1A"/>
                 <w:sz w:val="19"/>
               </w:rPr>
-              <w:t>사모가치 9,650억 달러</w:t>
+              <w:t>마진 25%만이면 약 1.1조</w:t>
             </w:r>
           </w:p>
         </w:tc>
@@ -2510,7 +2510,7 @@
                 <w:color w:val="1A1A1A"/>
                 <w:sz w:val="19"/>
               </w:rPr>
-              <w:t>IPO 2조 달러는 플랫폼화 Bull</w:t>
+              <w:t>2조는 그 위 플랫폼 배수 약 1.8배</w:t>
             </w:r>
           </w:p>
         </w:tc>
@@ -6237,7 +6237,7 @@
                 <w:color w:val="1A1A1A"/>
                 <w:sz w:val="21"/>
               </w:rPr>
-              <w:t>미국 메모리는 6~7배, 하이닉스·삼성 본주는 27년 4.1배입니다. 과거 한국 사이클 4~8배, 미국 10배 안팎의 틀 안에 있습니다.</w:t>
+              <w:t>미국 메모리는 6~7배, 하이닉스·삼성 본주는 27년 4.1배입니다. 본주는 마이크론 CY27 6.0배보다 약 31% 쌉니다.</w:t>
             </w:r>
           </w:p>
           <w:p>
@@ -6252,7 +6252,7 @@
                 <w:color w:val="1A1A1A"/>
                 <w:sz w:val="21"/>
               </w:rPr>
-              <w:t>ADR은 본주 대비 44% 프리미엄입니다. 30%로 좁히면 본주 202만원, 20%면 219만원입니다.</w:t>
+              <w:t>ADR 195.13달러 × 1,347원 = 26.3만원입니다. 263만원과 프리미엄 43%, 본주 202만·219만은 배율 10(ADR 10주 = 본주 1주)일 때만 성립합니다. 그 배율은 원문에 없고, 확인 전에는 확정 목표로 쓰지 않습니다.</w:t>
             </w:r>
           </w:p>
           <w:p>
@@ -6904,7 +6904,7 @@
                 <w:color w:val="1A1A1A"/>
                 <w:sz w:val="19"/>
               </w:rPr>
-              <w:t>= 263만원</w:t>
+              <w:t>×1,347 = 26.3만원</w:t>
             </w:r>
           </w:p>
         </w:tc>
@@ -6933,7 +6933,7 @@
                 <w:color w:val="1A1A1A"/>
                 <w:sz w:val="19"/>
               </w:rPr>
-              <w:t>26년 / 27년</w:t>
+              <w:t>×10 = 263만원</w:t>
             </w:r>
           </w:p>
         </w:tc>
@@ -6962,7 +6962,7 @@
                 <w:color w:val="1A1A1A"/>
                 <w:sz w:val="19"/>
               </w:rPr>
-              <w:t>7.5배 / 5.9배</w:t>
+              <w:t>배율 10일 때만 프리미엄 43%</w:t>
             </w:r>
           </w:p>
         </w:tc>
@@ -7470,7 +7470,7 @@
           <w:color w:val="1A1A1A"/>
           <w:sz w:val="22"/>
         </w:rPr>
-        <w:t>ADR 환산은 1,347원/달러입니다. 하이닉스 ADR은 마이크론과 거의 동급이고, 과거 한국 주식이 받던 −20~−50% 할인과는 다른 자리입니다. 27년 EPS에 환율 하향 여지(증권사 1,480원 → 1,370원)를 넣으면 할인율은 한 자릿수로 줄고, 실질적으로는 10% 중반대 할인으로 봐도 됩니다.</w:t>
+        <w:t>195.13 × 1,347 = 262,840원, 26.3만원입니다. 10을 곱하면 262.8만원이고, 원문의 263만원·PER 7.5배·5.9배·프리미엄 43%가 맞습니다. 그 10은 1 ADR = 본주 0.1주라는 뜻인데 원문은 적지 않았습니다. 8월 18일 환산도 같은 10배입니다. 배율이 확인되기 전에는 202만원·219만원을 본주 목표로 확정하지 않습니다.</w:t>
       </w:r>
     </w:p>
     <w:p>
@@ -7486,7 +7486,7 @@
           <w:color w:val="1A1A1A"/>
           <w:sz w:val="22"/>
         </w:rPr>
-        <w:t>원화 강세 5~10%는 삼전·닉스에 6~12% 하락 요인입니다. 27년 환율 가정이 1,480원에서 1,370원으로 바뀌면 현재 컨센서스에 약 10% 하향 여지가 있습니다. 그 조정을 반영해도 본주의 마이크론 대비 할인은 −30% 초반으로, 과거 할인 범위의 중간입니다.</w:t>
+        <w:t>상대가치는 본주만 씁니다. 27년 4.15배는 마이크론 CY27 5.97배보다 30.5% 쌉니다. 환율 가정을 1,480원에서 1,370원으로 바꾸면 1차 효과는 −7.4%입니다. 약 −10%는 전가와 믹스까지 넣은 버퍼로만 말합니다.</w:t>
       </w:r>
     </w:p>
     <w:p>
@@ -7922,7 +7922,23 @@
           <w:color w:val="1E407C"/>
           <w:sz w:val="26"/>
         </w:rPr>
-        <w:t>3) ADR 프리미엄으로 본주를 되돌리면</w:t>
+        <w:t>3) 28년 EPS로 다시 보면 4.1배가 아니다</w:t>
+      </w:r>
+    </w:p>
+    <w:p>
+      <w:pPr>
+        <w:spacing w:after="120" w:before="0" w:line="283" w:lineRule="auto"/>
+        <w:jc w:val="left"/>
+      </w:pPr>
+      <w:r>
+        <w:rPr>
+          <w:rFonts w:ascii="맑은 고딕" w:hAnsi="맑은 고딕" w:eastAsia="맑은 고딕"/>
+          <w:b w:val="0"/>
+          <w:i w:val="0"/>
+          <w:color w:val="1A1A1A"/>
+          <w:sz w:val="22"/>
+        </w:rPr>
+        <w:t>4.1배는 27년 EPS 44.4만원의 배수입니다. 원문이 말하는 정상화 EPS의 중심을 28만원으로 두면, 현재 184.2만원은 그 이익의 6.6배입니다.</w:t>
       </w:r>
     </w:p>
     <w:tbl>
@@ -7951,7 +7967,7 @@
         </w:trPr>
         <w:tc>
           <w:tcPr>
-            <w:tcW w:type="dxa" w:w="2268"/>
+            <w:tcW w:type="dxa" w:w="3175"/>
             <w:shd w:val="clear" w:color="auto" w:fill="0F2043"/>
             <w:tcMar>
               <w:top w:w="60" w:type="dxa"/>
@@ -7974,13 +7990,13 @@
                 <w:color w:val="FFFFFF"/>
                 <w:sz w:val="19"/>
               </w:rPr>
-              <w:t>프리미엄 가정</w:t>
-            </w:r>
-          </w:p>
-        </w:tc>
-        <w:tc>
-          <w:tcPr>
-            <w:tcW w:type="dxa" w:w="2948"/>
+              <w:t>28년 EPS 28만원에</w:t>
+            </w:r>
+          </w:p>
+        </w:tc>
+        <w:tc>
+          <w:tcPr>
+            <w:tcW w:type="dxa" w:w="2835"/>
             <w:shd w:val="clear" w:color="auto" w:fill="0F2043"/>
             <w:tcMar>
               <w:top w:w="60" w:type="dxa"/>
@@ -8003,13 +8019,13 @@
                 <w:color w:val="FFFFFF"/>
                 <w:sz w:val="19"/>
               </w:rPr>
-              <w:t>본주 환산</w:t>
-            </w:r>
-          </w:p>
-        </w:tc>
-        <w:tc>
-          <w:tcPr>
-            <w:tcW w:type="dxa" w:w="4762"/>
+              <w:t>주가</w:t>
+            </w:r>
+          </w:p>
+        </w:tc>
+        <w:tc>
+          <w:tcPr>
+            <w:tcW w:type="dxa" w:w="3969"/>
             <w:shd w:val="clear" w:color="auto" w:fill="0F2043"/>
             <w:tcMar>
               <w:top w:w="60" w:type="dxa"/>
@@ -8032,7 +8048,7 @@
                 <w:color w:val="FFFFFF"/>
                 <w:sz w:val="19"/>
               </w:rPr>
-              <w:t>의미</w:t>
+              <w:t>현재 184.2만원 대비</w:t>
             </w:r>
           </w:p>
         </w:tc>
@@ -8043,7 +8059,7 @@
         </w:trPr>
         <w:tc>
           <w:tcPr>
-            <w:tcW w:type="dxa" w:w="2268"/>
+            <w:tcW w:type="dxa" w:w="3175"/>
             <w:shd w:val="clear" w:color="auto" w:fill="FFFFFF"/>
             <w:tcMar>
               <w:top w:w="60" w:type="dxa"/>
@@ -8066,13 +8082,13 @@
                 <w:color w:val="1A1A1A"/>
                 <w:sz w:val="19"/>
               </w:rPr>
-              <w:t>현재 44%</w:t>
-            </w:r>
-          </w:p>
-        </w:tc>
-        <w:tc>
-          <w:tcPr>
-            <w:tcW w:type="dxa" w:w="2948"/>
+              <w:t>4배</w:t>
+            </w:r>
+          </w:p>
+        </w:tc>
+        <w:tc>
+          <w:tcPr>
+            <w:tcW w:type="dxa" w:w="2835"/>
             <w:shd w:val="clear" w:color="auto" w:fill="FFFFFF"/>
             <w:tcMar>
               <w:top w:w="60" w:type="dxa"/>
@@ -8095,13 +8111,13 @@
                 <w:color w:val="1A1A1A"/>
                 <w:sz w:val="19"/>
               </w:rPr>
-              <w:t>184.2만원 (실제)</w:t>
-            </w:r>
-          </w:p>
-        </w:tc>
-        <w:tc>
-          <w:tcPr>
-            <w:tcW w:type="dxa" w:w="4762"/>
+              <w:t>112만원</w:t>
+            </w:r>
+          </w:p>
+        </w:tc>
+        <w:tc>
+          <w:tcPr>
+            <w:tcW w:type="dxa" w:w="3969"/>
             <w:shd w:val="clear" w:color="auto" w:fill="FFFFFF"/>
             <w:tcMar>
               <w:top w:w="60" w:type="dxa"/>
@@ -8124,7 +8140,7 @@
                 <w:color w:val="1A1A1A"/>
                 <w:sz w:val="19"/>
               </w:rPr>
-              <w:t>ADR 263만원 / 본주</w:t>
+              <w:t>−39%</w:t>
             </w:r>
           </w:p>
         </w:tc>
@@ -8135,7 +8151,7 @@
         </w:trPr>
         <w:tc>
           <w:tcPr>
-            <w:tcW w:type="dxa" w:w="2268"/>
+            <w:tcW w:type="dxa" w:w="3175"/>
             <w:shd w:val="clear" w:color="auto" w:fill="F7F9FC"/>
             <w:tcMar>
               <w:top w:w="60" w:type="dxa"/>
@@ -8158,13 +8174,13 @@
                 <w:color w:val="1A1A1A"/>
                 <w:sz w:val="19"/>
               </w:rPr>
-              <w:t>30%</w:t>
-            </w:r>
-          </w:p>
-        </w:tc>
-        <w:tc>
-          <w:tcPr>
-            <w:tcW w:type="dxa" w:w="2948"/>
+              <w:t>6배</w:t>
+            </w:r>
+          </w:p>
+        </w:tc>
+        <w:tc>
+          <w:tcPr>
+            <w:tcW w:type="dxa" w:w="2835"/>
             <w:shd w:val="clear" w:color="auto" w:fill="F7F9FC"/>
             <w:tcMar>
               <w:top w:w="60" w:type="dxa"/>
@@ -8187,13 +8203,13 @@
                 <w:color w:val="1A1A1A"/>
                 <w:sz w:val="19"/>
               </w:rPr>
-              <w:t>202만원</w:t>
-            </w:r>
-          </w:p>
-        </w:tc>
-        <w:tc>
-          <w:tcPr>
-            <w:tcW w:type="dxa" w:w="4762"/>
+              <w:t>168만원</w:t>
+            </w:r>
+          </w:p>
+        </w:tc>
+        <w:tc>
+          <w:tcPr>
+            <w:tcW w:type="dxa" w:w="3969"/>
             <w:shd w:val="clear" w:color="auto" w:fill="F7F9FC"/>
             <w:tcMar>
               <w:top w:w="60" w:type="dxa"/>
@@ -8216,7 +8232,7 @@
                 <w:color w:val="1A1A1A"/>
                 <w:sz w:val="19"/>
               </w:rPr>
-              <w:t>최근 실제 프리미엄을 한 단계 정상화</w:t>
+              <w:t>−9%</w:t>
             </w:r>
           </w:p>
         </w:tc>
@@ -8227,7 +8243,7 @@
         </w:trPr>
         <w:tc>
           <w:tcPr>
-            <w:tcW w:type="dxa" w:w="2268"/>
+            <w:tcW w:type="dxa" w:w="3175"/>
             <w:shd w:val="clear" w:color="auto" w:fill="FFFFFF"/>
             <w:tcMar>
               <w:top w:w="60" w:type="dxa"/>
@@ -8250,13 +8266,13 @@
                 <w:color w:val="1A1A1A"/>
                 <w:sz w:val="19"/>
               </w:rPr>
-              <w:t>20%</w:t>
-            </w:r>
-          </w:p>
-        </w:tc>
-        <w:tc>
-          <w:tcPr>
-            <w:tcW w:type="dxa" w:w="2948"/>
+              <w:t>8배</w:t>
+            </w:r>
+          </w:p>
+        </w:tc>
+        <w:tc>
+          <w:tcPr>
+            <w:tcW w:type="dxa" w:w="2835"/>
             <w:shd w:val="clear" w:color="auto" w:fill="FFFFFF"/>
             <w:tcMar>
               <w:top w:w="60" w:type="dxa"/>
@@ -8279,13 +8295,13 @@
                 <w:color w:val="1A1A1A"/>
                 <w:sz w:val="19"/>
               </w:rPr>
-              <w:t>219만원</w:t>
-            </w:r>
-          </w:p>
-        </w:tc>
-        <w:tc>
-          <w:tcPr>
-            <w:tcW w:type="dxa" w:w="4762"/>
+              <w:t>224만원</w:t>
+            </w:r>
+          </w:p>
+        </w:tc>
+        <w:tc>
+          <w:tcPr>
+            <w:tcW w:type="dxa" w:w="3969"/>
             <w:shd w:val="clear" w:color="auto" w:fill="FFFFFF"/>
             <w:tcMar>
               <w:top w:w="60" w:type="dxa"/>
@@ -8308,7 +8324,99 @@
                 <w:color w:val="1A1A1A"/>
                 <w:sz w:val="19"/>
               </w:rPr>
-              <w:t>TSMC식 정상 프리미엄에 가까운 자리</w:t>
+              <w:t>+22%</w:t>
+            </w:r>
+          </w:p>
+        </w:tc>
+      </w:tr>
+      <w:tr>
+        <w:trPr>
+          <w:cantSplit/>
+        </w:trPr>
+        <w:tc>
+          <w:tcPr>
+            <w:tcW w:type="dxa" w:w="3175"/>
+            <w:shd w:val="clear" w:color="auto" w:fill="F7F9FC"/>
+            <w:tcMar>
+              <w:top w:w="60" w:type="dxa"/>
+              <w:left w:w="80" w:type="dxa"/>
+              <w:bottom w:w="60" w:type="dxa"/>
+              <w:right w:w="80" w:type="dxa"/>
+            </w:tcMar>
+          </w:tcPr>
+          <w:p>
+            <w:pPr>
+              <w:spacing w:before="0" w:after="0" w:line="269" w:lineRule="auto"/>
+              <w:jc w:val="left"/>
+            </w:pPr>
+            <w:r/>
+            <w:r>
+              <w:rPr>
+                <w:rFonts w:ascii="맑은 고딕" w:hAnsi="맑은 고딕" w:eastAsia="맑은 고딕"/>
+                <w:b/>
+                <w:i w:val="0"/>
+                <w:color w:val="1A1A1A"/>
+                <w:sz w:val="19"/>
+              </w:rPr>
+              <w:t>9배</w:t>
+            </w:r>
+          </w:p>
+        </w:tc>
+        <w:tc>
+          <w:tcPr>
+            <w:tcW w:type="dxa" w:w="2835"/>
+            <w:shd w:val="clear" w:color="auto" w:fill="F7F9FC"/>
+            <w:tcMar>
+              <w:top w:w="60" w:type="dxa"/>
+              <w:left w:w="80" w:type="dxa"/>
+              <w:bottom w:w="60" w:type="dxa"/>
+              <w:right w:w="80" w:type="dxa"/>
+            </w:tcMar>
+          </w:tcPr>
+          <w:p>
+            <w:pPr>
+              <w:spacing w:before="0" w:after="0" w:line="269" w:lineRule="auto"/>
+              <w:jc w:val="center"/>
+            </w:pPr>
+            <w:r/>
+            <w:r>
+              <w:rPr>
+                <w:rFonts w:ascii="맑은 고딕" w:hAnsi="맑은 고딕" w:eastAsia="맑은 고딕"/>
+                <w:b w:val="0"/>
+                <w:i w:val="0"/>
+                <w:color w:val="1A1A1A"/>
+                <w:sz w:val="19"/>
+              </w:rPr>
+              <w:t>252만원</w:t>
+            </w:r>
+          </w:p>
+        </w:tc>
+        <w:tc>
+          <w:tcPr>
+            <w:tcW w:type="dxa" w:w="3969"/>
+            <w:shd w:val="clear" w:color="auto" w:fill="F7F9FC"/>
+            <w:tcMar>
+              <w:top w:w="60" w:type="dxa"/>
+              <w:left w:w="80" w:type="dxa"/>
+              <w:bottom w:w="60" w:type="dxa"/>
+              <w:right w:w="80" w:type="dxa"/>
+            </w:tcMar>
+          </w:tcPr>
+          <w:p>
+            <w:pPr>
+              <w:spacing w:before="0" w:after="0" w:line="269" w:lineRule="auto"/>
+              <w:jc w:val="center"/>
+            </w:pPr>
+            <w:r/>
+            <w:r>
+              <w:rPr>
+                <w:rFonts w:ascii="맑은 고딕" w:hAnsi="맑은 고딕" w:eastAsia="맑은 고딕"/>
+                <w:b w:val="0"/>
+                <w:i w:val="0"/>
+                <w:color w:val="1A1A1A"/>
+                <w:sz w:val="19"/>
+              </w:rPr>
+              <w:t>+37%</w:t>
             </w:r>
           </w:p>
         </w:tc>
@@ -8318,6 +8426,22 @@
       <w:pPr>
         <w:spacing w:after="160" w:before="40"/>
       </w:pPr>
+    </w:p>
+    <w:p>
+      <w:pPr>
+        <w:spacing w:after="120" w:before="0" w:line="283" w:lineRule="auto"/>
+        <w:jc w:val="left"/>
+      </w:pPr>
+      <w:r>
+        <w:rPr>
+          <w:rFonts w:ascii="맑은 고딕" w:hAnsi="맑은 고딕" w:eastAsia="맑은 고딕"/>
+          <w:b w:val="0"/>
+          <w:i w:val="0"/>
+          <w:color w:val="1A1A1A"/>
+          <w:sz w:val="22"/>
+        </w:rPr>
+        <w:t>220~250만원은 8~9배 칸입니다. 과거 사이클 4~6배에 머물면 현재가보다 낮습니다. 업사이드의 조건은 28년 EPS가 28만원 근처에 남고, 배수가 8배 이상으로 올라가는 것입니다.</w:t>
+      </w:r>
     </w:p>
     <w:p>
       <w:pPr>
@@ -8936,7 +9060,7 @@
                 <w:color w:val="1A1A1A"/>
                 <w:sz w:val="21"/>
               </w:rPr>
-              <w:t>분기 영업이익은 65~75조에서 피크 100~110조로 더 크게 올랐다가, 28년 상반기 55~75조로 가격보다 덜 빠지는 쪽을 먼저 생각합니다.</w:t>
+              <w:t>분기 영업이익은 65~75조에서 피크 100~110조로 올랐다가, 28년 상반기 Base 60~75조입니다. 과거 −70~−80%보다는 완만하고, Base 한복판은 피크 대비 약 −36%로 가격 −26%보다 큽니다.</w:t>
             </w:r>
           </w:p>
           <w:p>
@@ -11618,7 +11742,7 @@
           <w:color w:val="1A1A1A"/>
           <w:sz w:val="22"/>
         </w:rPr>
-        <w:t>Bear에서 ASP −25%, 비트 성장 +15~20%를 넣으면 매출은 −25%가 아니라 −5~−10%입니다. 그래도 마진이 줄므로 영업이익은 매출보다 크게 감소합니다. 피크 분기 100~110조에서 28년 상반기 55~70조가 이 하락 시나리오의 기본이고, 매우 공격적인 Bear에서 40조 이하가 나옵니다.</w:t>
+        <w:t>Bear에서 ASP −25%와 비트 성장 +15~20%를 같이 쓰면 매출은 −14~−10%입니다. 매출 −5%를 말하려면 비트 성장이 +27%여야 합니다. 영업이익은 매출보다 더 줄어, 피크 100~110조에서 28년 상반기 60~75조가 Base이고 40조 이하는 극단입니다. 네 귀퉁이는 피크 대비 −25%(100→75)에서 −45%(110→60)이고, 한복판 105조→67.5조는 −36%입니다.</w:t>
       </w:r>
     </w:p>
     <w:p>
@@ -11634,7 +11758,7 @@
           <w:color w:val="1A1A1A"/>
           <w:sz w:val="22"/>
         </w:rPr>
-        <w:t>BNK의 27년 4분기 40조 이하는, 26년 3분기 가격이 거의 반토막(BNK 자체 전망 43% 하락) 나야 하는 숫자입니다. 불가능한 숫자는 아니지만, 상당히 강한 가격 하락을 전제한 Bear입니다.</w:t>
+        <w:t>BNK의 27년 4분기 40조 이하는 가격 −43%(지수 57, 반토막인 50이 아닙니다)를 전제합니다. 2027년 249조에서 4분기 40조를 빼면 1~3분기 평균은 약 70조라 산술적으로 불가능하지는 않습니다. 극단으로 두는 이유는, 249조가 동종 2027년 평균 약 404조보다 이미 38% 낮기 때문입니다.</w:t>
       </w:r>
     </w:p>
     <w:p>
@@ -13220,7 +13344,7 @@
                 <w:color w:val="1A1A1A"/>
                 <w:sz w:val="19"/>
               </w:rPr>
-              <w:t>263만원</w:t>
+              <w:t>배율 10이면 263만원</w:t>
             </w:r>
           </w:p>
         </w:tc>
@@ -13530,6 +13654,22 @@
       <w:pPr>
         <w:spacing w:after="160" w:before="40"/>
       </w:pPr>
+    </w:p>
+    <w:p>
+      <w:pPr>
+        <w:spacing w:after="120" w:before="0" w:line="283" w:lineRule="auto"/>
+        <w:jc w:val="left"/>
+      </w:pPr>
+      <w:r>
+        <w:rPr>
+          <w:rFonts w:ascii="맑은 고딕" w:hAnsi="맑은 고딕" w:eastAsia="맑은 고딕"/>
+          <w:b w:val="0"/>
+          <w:i w:val="0"/>
+          <w:color w:val="1A1A1A"/>
+          <w:sz w:val="22"/>
+        </w:rPr>
+        <w:t>ADR 7.5배·5.9배는 배율 10일 때의 숫자입니다. 배율 1이면 환산가는 26.3만원이고 이 배수는 쓰지 않습니다. 배율과 무관한 할인율은 본주 27년 4.1배 대 마이크론 6.0배, 약 31%입니다.</w:t>
+      </w:r>
     </w:p>
     <w:p>
       <w:pPr>
@@ -13618,7 +13758,7 @@
                 <w:color w:val="1A1A1A"/>
                 <w:sz w:val="21"/>
               </w:rPr>
-              <w:t>정상화 EPS 20만원 후반 × 8~9배 = 220~250만원.</w:t>
+              <w:t>EPS 28만원 × 8~9배 = 224~252만원. 원문의 220~250만원은 이 반올림입니다.</w:t>
             </w:r>
           </w:p>
           <w:p>
@@ -13633,7 +13773,7 @@
                 <w:color w:val="1A1A1A"/>
                 <w:sz w:val="21"/>
               </w:rPr>
-              <w:t>4~6배대 PER은 피크 이익 착시입니다. 핵심은 2027년 EPS가 아니라 2028년 정상화 EPS입니다.</w:t>
+              <w:t>현재 184만원은 그 28만원의 6.6배입니다. 4.1배는 27년 EPS의 배수입니다. 4~6배(112~168만원)에 머물면 현재가보다 낮습니다.</w:t>
             </w:r>
           </w:p>
         </w:tc>
@@ -17072,7 +17212,7 @@
                 <w:color w:val="1A1A1A"/>
                 <w:sz w:val="21"/>
               </w:rPr>
-              <w:t>현시점에서 볼 자리는 28년 PER 30~40배의 하단, 5~6만원 중반이고, 거기에 안전마진을 더합니다. 주식 수는 전환 후 111백만주입니다.</w:t>
+              <w:t>7만원이 50배라면 EPS는 1,400원입니다. 이 1,400원이 이미 111백만주면 30배는 4.2만원, 40배는 5.6만원입니다. 희석 전이면 30~40배는 2.9~3.8만원입니다. 5~6만원 중반을 30배의 하단으로 말하지 않습니다.</w:t>
             </w:r>
           </w:p>
         </w:tc>
@@ -18913,7 +19053,7 @@
                 <w:color w:val="1A1A1A"/>
                 <w:sz w:val="21"/>
               </w:rPr>
-              <w:t>지금은 28년 PER 30~40배의 하단까지 봅니다. 5~6만원 중반. 거기에 안전마진을 적용하는 것이 적절한 시각입니다.</w:t>
+              <w:t>검색 PER 40~45배가 희석 전이면, 28년 이익이 두 배가 돼도 현재 31,200원은 이미 희석 28년 29~33배입니다. 30배 가격은 2.8~3.2만원입니다.</w:t>
             </w:r>
           </w:p>
           <w:p>
@@ -18928,7 +19068,7 @@
                 <w:color w:val="1A1A1A"/>
                 <w:sz w:val="21"/>
               </w:rPr>
-              <w:t>10/2 주가 31,200원은 그 5~6만원 중반보다 아래입니다. 7만원을 현재 목표로 그대로 쓰지는 않습니다.</w:t>
+              <w:t>검색 PER이 이미 111백만주라면 30배는 4.2~4.7만원입니다. 주수를 확인하기 전에는 한 목표가로 말하지 않습니다. 7만원은 50배라 현재 목표로 쓰지 않습니다.</w:t>
             </w:r>
           </w:p>
         </w:tc>
@@ -22100,7 +22240,7 @@
                 <w:color w:val="1A1A1A"/>
                 <w:sz w:val="21"/>
               </w:rPr>
-              <w:t>시장이 크다는 전제만으로는 2조 달러가 나오지 않습니다.</w:t>
+              <w:t>베이스 8,910억 달러에서 사모가치 9,650억 달러는, 같은 마진에서 CAGR을 20%에서 21.4%로 올리면 설명됩니다.</w:t>
             </w:r>
           </w:p>
           <w:p>
@@ -22115,7 +22255,7 @@
                 <w:color w:val="1A1A1A"/>
                 <w:sz w:val="21"/>
               </w:rPr>
-              <w:t>사용량 과금이 업무 흐름의 반복 매출로 바뀌고, 잉여현금흐름률이 25%까지 가야 하는 Bull입니다.</w:t>
+              <w:t>마진만 20%에서 25%로 올리고 성장 20%를 유지하면 약 1.1조 달러입니다. 2조 달러는 그 위에 플랫폼 배수가 약 1.8배 더 붙어야 합니다.</w:t>
             </w:r>
           </w:p>
           <w:p>
@@ -22130,7 +22270,7 @@
                 <w:color w:val="1A1A1A"/>
                 <w:sz w:val="21"/>
               </w:rPr>
-              <w:t>그 전제가 어긋나면 높은 컴퓨팅 비용이 가치를 빠르게 깎습니다.</w:t>
+              <w:t>그래서 2조는 시장 규모가 아니라 플랫폼 프리미엄의 자리입니다. 실패하면 컴퓨팅 비용이 그 배수를 지웁니다.</w:t>
             </w:r>
           </w:p>
         </w:tc>
@@ -22255,7 +22395,7 @@
                 <w:color w:val="1A1A1A"/>
                 <w:sz w:val="21"/>
               </w:rPr>
-              <w:t>3) 광: GPU 다음이 스위치, 구리, 광, CPO입니다. 중국 규제는 3.2T 공급망 설계이고, 두산 CCL 급락은 과민입니다. 성호전자는 정렬 장비이며, 주식 수는 111백만주, 보는 자리는 5~6만원 중반에 안전마진입니다.</w:t>
+              <w:t>3) 광: GPU 다음이 스위치, 구리, 광, CPO입니다. 두산 CCL 3분기 1,059억은 규제 헤드라인과 다른 층입니다. 성호전자는 정렬 장비이고, 30배 하단은 희석이면 4.2만원, 희석 전이면 2.9만원입니다.</w:t>
             </w:r>
           </w:p>
           <w:p>
@@ -22270,7 +22410,7 @@
                 <w:color w:val="1A1A1A"/>
                 <w:sz w:val="21"/>
               </w:rPr>
-              <w:t>4) HDD와 앤트로픽: HDD −10%는 도시바 물량이 오늘 나온 것이 아니라 20배대 멀티플이 흔들린 것입니다. 앤트로픽 2조 달러는 플랫폼이 돼야 나오는 Bull이고, 그 제품 속도가 메모리 수요의 빈 논박을 채웁니다.</w:t>
+              <w:t>4) HDD와 앤트로픽: HDD −10%는 26배·23배 멀티플의 압축입니다. 앤트로픽 2조는 마진 25%만으로 안 나오고, 약 1.1조 위에 플랫폼 배수 1.8배가 더 필요합니다.</w:t>
             </w:r>
           </w:p>
         </w:tc>

</xml_diff>